<commit_message>
working on FrontEnd and fix bugs and issuces
</commit_message>
<xml_diff>
--- a/backend/generated_resumes/resume_5_professional.docx
+++ b/backend/generated_resumes/resume_5_professional.docx
@@ -13,20 +13,7 @@
           <w:color w:val="2C3E50"/>
           <w:sz w:val="40"/>
         </w:rPr>
-        <w:t>ABDULRAHMAN AHMED ALSHUWAYSHI</w:t>
-      </w:r>
-    </w:p>
-    <w:p>
-      <w:pPr>
-        <w:jc w:val="center"/>
-      </w:pPr>
-      <w:r>
-        <w:rPr>
-          <w:rFonts w:ascii="Calibri" w:hAnsi="Calibri"/>
-          <w:color w:val="3498DB"/>
-          <w:sz w:val="18"/>
-        </w:rPr>
-        <w:t>📧 abdulrhman.57.57@gmail.com  |  📱 +966 500462242</w:t>
+        <w:t>YOUR NAME</w:t>
       </w:r>
     </w:p>
     <w:p>
@@ -36,312 +23,6 @@
           <w:bottom w:val="single" w:sz="6" w:space="1" w:color="2C3E50"/>
         </w:pBdr>
       </w:pPr>
-    </w:p>
-    <w:p>
-      <w:pPr>
-        <w:spacing w:before="160" w:after="80"/>
-      </w:pPr>
-      <w:r>
-        <w:rPr>
-          <w:rFonts w:ascii="Calibri" w:hAnsi="Calibri"/>
-          <w:b/>
-          <w:color w:val="2C3E50"/>
-          <w:sz w:val="22"/>
-        </w:rPr>
-        <w:t>WORK EXPERIENCE</w:t>
-      </w:r>
-    </w:p>
-    <w:p>
-      <w:pPr>
-        <w:spacing w:before="80"/>
-      </w:pPr>
-      <w:r>
-        <w:rPr>
-          <w:rFonts w:ascii="Calibri" w:hAnsi="Calibri"/>
-          <w:b/>
-          <w:sz w:val="20"/>
-        </w:rPr>
-        <w:t>None | Etisal Company (Lebara)</w:t>
-      </w:r>
-    </w:p>
-    <w:p>
-      <w:r>
-        <w:rPr>
-          <w:rFonts w:ascii="Calibri" w:hAnsi="Calibri"/>
-          <w:color w:val="3498DB"/>
-          <w:sz w:val="18"/>
-        </w:rPr>
-        <w:t>📅 2024-Present</w:t>
-      </w:r>
-    </w:p>
-    <w:p>
-      <w:pPr>
-        <w:spacing w:before="80"/>
-      </w:pPr>
-      <w:r>
-        <w:rPr>
-          <w:rFonts w:ascii="Calibri" w:hAnsi="Calibri"/>
-          <w:b/>
-          <w:sz w:val="20"/>
-        </w:rPr>
-        <w:t>Legal Researcher | Saudi Railway Company</w:t>
-      </w:r>
-    </w:p>
-    <w:p>
-      <w:r>
-        <w:rPr>
-          <w:rFonts w:ascii="Calibri" w:hAnsi="Calibri"/>
-          <w:color w:val="3498DB"/>
-          <w:sz w:val="18"/>
-        </w:rPr>
-        <w:t>📅 2020</w:t>
-      </w:r>
-    </w:p>
-    <w:p>
-      <w:pPr>
-        <w:spacing w:before="80"/>
-      </w:pPr>
-      <w:r>
-        <w:rPr>
-          <w:rFonts w:ascii="Calibri" w:hAnsi="Calibri"/>
-          <w:b/>
-          <w:sz w:val="20"/>
-        </w:rPr>
-        <w:t>Cashier | Graat Alsalad For me als company</w:t>
-      </w:r>
-    </w:p>
-    <w:p>
-      <w:r>
-        <w:rPr>
-          <w:rFonts w:ascii="Calibri" w:hAnsi="Calibri"/>
-          <w:color w:val="3498DB"/>
-          <w:sz w:val="18"/>
-        </w:rPr>
-        <w:t>📅 2018-2019</w:t>
-      </w:r>
-    </w:p>
-    <w:p>
-      <w:pPr>
-        <w:spacing w:before="80"/>
-      </w:pPr>
-      <w:r>
-        <w:rPr>
-          <w:rFonts w:ascii="Calibri" w:hAnsi="Calibri"/>
-          <w:b/>
-          <w:sz w:val="20"/>
-        </w:rPr>
-        <w:t>Cashier | Albaraka Commercial</w:t>
-      </w:r>
-    </w:p>
-    <w:p>
-      <w:r>
-        <w:rPr>
-          <w:rFonts w:ascii="Calibri" w:hAnsi="Calibri"/>
-          <w:color w:val="3498DB"/>
-          <w:sz w:val="18"/>
-        </w:rPr>
-        <w:t>📅 2017-2018</w:t>
-      </w:r>
-    </w:p>
-    <w:p>
-      <w:pPr>
-        <w:spacing w:before="80"/>
-      </w:pPr>
-      <w:r>
-        <w:rPr>
-          <w:rFonts w:ascii="Calibri" w:hAnsi="Calibri"/>
-          <w:b/>
-          <w:sz w:val="20"/>
-        </w:rPr>
-        <w:t>Reception | Afyaa Alnakeel Limited Support Services company</w:t>
-      </w:r>
-    </w:p>
-    <w:p>
-      <w:r>
-        <w:rPr>
-          <w:rFonts w:ascii="Calibri" w:hAnsi="Calibri"/>
-          <w:color w:val="3498DB"/>
-          <w:sz w:val="18"/>
-        </w:rPr>
-        <w:t>📅 2015-2016</w:t>
-      </w:r>
-    </w:p>
-    <w:p>
-      <w:pPr>
-        <w:spacing w:before="40" w:after="40"/>
-        <w:pBdr>
-          <w:bottom w:val="single" w:sz="6" w:space="1" w:color="2C3E50"/>
-        </w:pBdr>
-      </w:pPr>
-    </w:p>
-    <w:p>
-      <w:pPr>
-        <w:spacing w:before="160" w:after="80"/>
-      </w:pPr>
-      <w:r>
-        <w:rPr>
-          <w:rFonts w:ascii="Calibri" w:hAnsi="Calibri"/>
-          <w:b/>
-          <w:color w:val="2C3E50"/>
-          <w:sz w:val="22"/>
-        </w:rPr>
-        <w:t>EDUCATION</w:t>
-      </w:r>
-    </w:p>
-    <w:p>
-      <w:pPr>
-        <w:spacing w:before="80"/>
-      </w:pPr>
-      <w:r>
-        <w:rPr>
-          <w:rFonts w:ascii="Calibri" w:hAnsi="Calibri"/>
-          <w:b/>
-          <w:sz w:val="20"/>
-        </w:rPr>
-        <w:t>Bachelor of Laws | King Saud University</w:t>
-      </w:r>
-    </w:p>
-    <w:p>
-      <w:r>
-        <w:rPr>
-          <w:rFonts w:ascii="Calibri" w:hAnsi="Calibri"/>
-          <w:color w:val="3498DB"/>
-          <w:sz w:val="18"/>
-        </w:rPr>
-        <w:t>📅 2015-2020</w:t>
-      </w:r>
-    </w:p>
-    <w:p>
-      <w:pPr>
-        <w:spacing w:before="40" w:after="40"/>
-        <w:pBdr>
-          <w:bottom w:val="single" w:sz="6" w:space="1" w:color="2C3E50"/>
-        </w:pBdr>
-      </w:pPr>
-    </w:p>
-    <w:p>
-      <w:pPr>
-        <w:spacing w:before="160" w:after="80"/>
-      </w:pPr>
-      <w:r>
-        <w:rPr>
-          <w:rFonts w:ascii="Calibri" w:hAnsi="Calibri"/>
-          <w:b/>
-          <w:color w:val="2C3E50"/>
-          <w:sz w:val="22"/>
-        </w:rPr>
-        <w:t>TECHNICAL SKILLS</w:t>
-      </w:r>
-    </w:p>
-    <w:p>
-      <w:pPr>
-        <w:spacing w:before="60"/>
-      </w:pPr>
-      <w:r>
-        <w:rPr>
-          <w:rFonts w:ascii="Calibri" w:hAnsi="Calibri"/>
-          <w:b/>
-          <w:sz w:val="19"/>
-        </w:rPr>
-        <w:t xml:space="preserve">Tools &amp; Technologies: </w:t>
-      </w:r>
-      <w:r>
-        <w:rPr>
-          <w:rFonts w:ascii="Calibri" w:hAnsi="Calibri"/>
-          <w:sz w:val="19"/>
-        </w:rPr>
-        <w:t>Microsoft Office</w:t>
-      </w:r>
-    </w:p>
-    <w:p>
-      <w:pPr>
-        <w:spacing w:before="60"/>
-      </w:pPr>
-      <w:r>
-        <w:rPr>
-          <w:rFonts w:ascii="Calibri" w:hAnsi="Calibri"/>
-          <w:b/>
-          <w:sz w:val="19"/>
-        </w:rPr>
-        <w:t xml:space="preserve">Other: </w:t>
-      </w:r>
-      <w:r>
-        <w:rPr>
-          <w:rFonts w:ascii="Calibri" w:hAnsi="Calibri"/>
-          <w:sz w:val="19"/>
-        </w:rPr>
-        <w:t>Communication, Presentation, Decision making, Writing and Drafting reports, Contracts review, Commercial awareness, Resilience and self-confidence, Creative thinking</w:t>
-      </w:r>
-    </w:p>
-    <w:p>
-      <w:pPr>
-        <w:spacing w:before="40" w:after="40"/>
-        <w:pBdr>
-          <w:bottom w:val="single" w:sz="6" w:space="1" w:color="2C3E50"/>
-        </w:pBdr>
-      </w:pPr>
-    </w:p>
-    <w:p>
-      <w:pPr>
-        <w:spacing w:before="160" w:after="80"/>
-      </w:pPr>
-      <w:r>
-        <w:rPr>
-          <w:rFonts w:ascii="Calibri" w:hAnsi="Calibri"/>
-          <w:b/>
-          <w:color w:val="2C3E50"/>
-          <w:sz w:val="22"/>
-        </w:rPr>
-        <w:t>CERTIFICATIONS</w:t>
-      </w:r>
-    </w:p>
-    <w:p>
-      <w:pPr>
-        <w:pStyle w:val="ListBullet"/>
-      </w:pPr>
-      <w:r>
-        <w:rPr>
-          <w:rFonts w:ascii="Calibri" w:hAnsi="Calibri"/>
-          <w:sz w:val="19"/>
-        </w:rPr>
-        <w:t>English course | Sheffield Academy</w:t>
-      </w:r>
-    </w:p>
-    <w:p>
-      <w:pPr>
-        <w:pStyle w:val="ListBullet"/>
-      </w:pPr>
-      <w:r>
-        <w:rPr>
-          <w:rFonts w:ascii="Calibri" w:hAnsi="Calibri"/>
-          <w:sz w:val="19"/>
-        </w:rPr>
-        <w:t>Microsoft Office Complete Course | Udemy</w:t>
-      </w:r>
-    </w:p>
-    <w:p>
-      <w:pPr>
-        <w:pStyle w:val="ListBullet"/>
-      </w:pPr>
-      <w:r>
-        <w:rPr>
-          <w:rFonts w:ascii="Calibri" w:hAnsi="Calibri"/>
-          <w:sz w:val="19"/>
-        </w:rPr>
-        <w:t>The Complete Communication Skills course | Udemy</w:t>
-      </w:r>
-    </w:p>
-    <w:p>
-      <w:pPr>
-        <w:pStyle w:val="ListBullet"/>
-      </w:pPr>
-      <w:r>
-        <w:rPr>
-          <w:rFonts w:ascii="Calibri" w:hAnsi="Calibri"/>
-          <w:sz w:val="19"/>
-        </w:rPr>
-        <w:t>Managing Different Personality Types course | Udemy</w:t>
-      </w:r>
     </w:p>
     <w:sectPr>
       <w:pgSz w:w="12240" w:h="15840"/>

</xml_diff>